<commit_message>
added tasks to the docs
</commit_message>
<xml_diff>
--- a/OSC-Assesment-2.docx
+++ b/OSC-Assesment-2.docx
@@ -2,6 +2,1059 @@
 <file path=word/document.xml><?xml version="1.0" encoding="utf-8"?>
 <w:document xmlns:wpc="http://schemas.microsoft.com/office/word/2010/wordprocessingCanvas" xmlns:cx="http://schemas.microsoft.com/office/drawing/2014/chartex" xmlns:cx1="http://schemas.microsoft.com/office/drawing/2015/9/8/chartex" xmlns:cx2="http://schemas.microsoft.com/office/drawing/2015/10/21/chartex" xmlns:cx3="http://schemas.microsoft.com/office/drawing/2016/5/9/chartex" xmlns:cx4="http://schemas.microsoft.com/office/drawing/2016/5/10/chartex" xmlns:cx5="http://schemas.microsoft.com/office/drawing/2016/5/11/chartex" xmlns:cx6="http://schemas.microsoft.com/office/drawing/2016/5/12/chartex" xmlns:cx7="http://schemas.microsoft.com/office/drawing/2016/5/13/chartex" xmlns:cx8="http://schemas.microsoft.com/office/drawing/2016/5/14/chartex" xmlns:mc="http://schemas.openxmlformats.org/markup-compatibility/2006" xmlns:aink="http://schemas.microsoft.com/office/drawing/2016/ink" xmlns:am3d="http://schemas.microsoft.com/office/drawing/2017/model3d" xmlns:o="urn:schemas-microsoft-com:office:office" xmlns:oel="http://schemas.microsoft.com/office/2019/extlst" xmlns:r="http://schemas.openxmlformats.org/officeDocument/2006/relationships" xmlns:m="http://schemas.openxmlformats.org/officeDocument/2006/math" xmlns:v="urn:schemas-microsoft-com:vml" xmlns:wp14="http://schemas.microsoft.com/office/word/2010/wordprocessingDrawing" xmlns:wp="http://schemas.openxmlformats.org/drawingml/2006/wordprocessingDrawing" xmlns:w10="urn:schemas-microsoft-com:office:word" xmlns:w="http://schemas.openxmlformats.org/wordprocessingml/2006/main" xmlns:w14="http://schemas.microsoft.com/office/word/2010/wordml" xmlns:w15="http://schemas.microsoft.com/office/word/2012/wordml" xmlns:w16cex="http://schemas.microsoft.com/office/word/2018/wordml/cex" xmlns:w16cid="http://schemas.microsoft.com/office/word/2016/wordml/cid" xmlns:w16="http://schemas.microsoft.com/office/word/2018/wordml" xmlns:w16du="http://schemas.microsoft.com/office/word/2023/wordml/word16du" xmlns:w16sdtdh="http://schemas.microsoft.com/office/word/2020/wordml/sdtdatahash" xmlns:w16sdtfl="http://schemas.microsoft.com/office/word/2024/wordml/sdtformatlock" xmlns:w16se="http://schemas.microsoft.com/office/word/2015/wordml/symex" xmlns:wpg="http://schemas.microsoft.com/office/word/2010/wordprocessingGroup" xmlns:wpi="http://schemas.microsoft.com/office/word/2010/wordprocessingInk" xmlns:wne="http://schemas.microsoft.com/office/word/2006/wordml" xmlns:wps="http://schemas.microsoft.com/office/word/2010/wordprocessingShape" mc:Ignorable="w14 w15 w16se w16cid w16 w16cex w16sdtdh w16sdtfl w16du wp14">
   <w:body>
+    <w:p>
+      <w:pPr>
+        <w:rPr>
+          <w:rFonts w:ascii="Arial" w:hAnsi="Arial" w:cs="Arial"/>
+        </w:rPr>
+      </w:pPr>
+      <w:r>
+        <w:rPr>
+          <w:rFonts w:ascii="Arial" w:hAnsi="Arial" w:cs="Arial"/>
+        </w:rPr>
+        <w:t>Task 1</w:t>
+      </w:r>
+    </w:p>
+    <w:p>
+      <w:pPr>
+        <w:rPr>
+          <w:rFonts w:ascii="Arial" w:hAnsi="Arial" w:cs="Arial"/>
+        </w:rPr>
+      </w:pPr>
+      <w:r>
+        <w:rPr>
+          <w:rFonts w:ascii="Arial" w:hAnsi="Arial" w:cs="Arial"/>
+        </w:rPr>
+        <w:t>Create and assign virtual networks (VMnet8, VMnet2, VMnet3) using the VMware Virtual Network Editor</w:t>
+      </w:r>
+    </w:p>
+    <w:p>
+      <w:pPr>
+        <w:rPr>
+          <w:rFonts w:ascii="Arial" w:hAnsi="Arial" w:cs="Arial"/>
+        </w:rPr>
+      </w:pPr>
+    </w:p>
+    <w:p>
+      <w:pPr>
+        <w:rPr>
+          <w:rFonts w:ascii="Arial" w:hAnsi="Arial" w:cs="Arial"/>
+        </w:rPr>
+      </w:pPr>
+      <w:r>
+        <w:rPr>
+          <w:rFonts w:ascii="Arial" w:hAnsi="Arial" w:cs="Arial"/>
+        </w:rPr>
+        <w:t xml:space="preserve">Attach correct network adapters to each VM: </w:t>
+      </w:r>
+    </w:p>
+    <w:p>
+      <w:pPr>
+        <w:rPr>
+          <w:rFonts w:ascii="Arial" w:hAnsi="Arial" w:cs="Arial"/>
+        </w:rPr>
+      </w:pPr>
+      <w:r>
+        <w:rPr>
+          <w:rFonts w:ascii="Arial" w:hAnsi="Arial" w:cs="Arial"/>
+        </w:rPr>
+        <w:t>– gateway-</w:t>
+      </w:r>
+      <w:proofErr w:type="spellStart"/>
+      <w:r>
+        <w:rPr>
+          <w:rFonts w:ascii="Arial" w:hAnsi="Arial" w:cs="Arial"/>
+        </w:rPr>
+        <w:t>vm</w:t>
+      </w:r>
+      <w:proofErr w:type="spellEnd"/>
+      <w:r>
+        <w:rPr>
+          <w:rFonts w:ascii="Arial" w:hAnsi="Arial" w:cs="Arial"/>
+        </w:rPr>
+        <w:t xml:space="preserve">: NAT, </w:t>
+      </w:r>
+      <w:proofErr w:type="spellStart"/>
+      <w:r>
+        <w:rPr>
+          <w:rFonts w:ascii="Arial" w:hAnsi="Arial" w:cs="Arial"/>
+        </w:rPr>
+        <w:t>BatNetwork</w:t>
+      </w:r>
+      <w:proofErr w:type="spellEnd"/>
+      <w:r>
+        <w:rPr>
+          <w:rFonts w:ascii="Arial" w:hAnsi="Arial" w:cs="Arial"/>
+        </w:rPr>
+        <w:t xml:space="preserve">, and </w:t>
+      </w:r>
+      <w:proofErr w:type="spellStart"/>
+      <w:r>
+        <w:rPr>
+          <w:rFonts w:ascii="Arial" w:hAnsi="Arial" w:cs="Arial"/>
+        </w:rPr>
+        <w:t>ManorNetwork</w:t>
+      </w:r>
+      <w:proofErr w:type="spellEnd"/>
+      <w:r>
+        <w:rPr>
+          <w:rFonts w:ascii="Arial" w:hAnsi="Arial" w:cs="Arial"/>
+        </w:rPr>
+        <w:t xml:space="preserve">. </w:t>
+      </w:r>
+    </w:p>
+    <w:p>
+      <w:pPr>
+        <w:rPr>
+          <w:rFonts w:ascii="Arial" w:hAnsi="Arial" w:cs="Arial"/>
+        </w:rPr>
+      </w:pPr>
+      <w:r>
+        <w:rPr>
+          <w:rFonts w:ascii="Arial" w:hAnsi="Arial" w:cs="Arial"/>
+        </w:rPr>
+        <w:t xml:space="preserve">– </w:t>
+      </w:r>
+      <w:proofErr w:type="spellStart"/>
+      <w:r>
+        <w:rPr>
+          <w:rFonts w:ascii="Arial" w:hAnsi="Arial" w:cs="Arial"/>
+        </w:rPr>
+        <w:t>batcave-vm</w:t>
+      </w:r>
+      <w:proofErr w:type="spellEnd"/>
+      <w:r>
+        <w:rPr>
+          <w:rFonts w:ascii="Arial" w:hAnsi="Arial" w:cs="Arial"/>
+        </w:rPr>
+        <w:t xml:space="preserve">: </w:t>
+      </w:r>
+      <w:proofErr w:type="spellStart"/>
+      <w:r>
+        <w:rPr>
+          <w:rFonts w:ascii="Arial" w:hAnsi="Arial" w:cs="Arial"/>
+        </w:rPr>
+        <w:t>BatNetwork</w:t>
+      </w:r>
+      <w:proofErr w:type="spellEnd"/>
+      <w:r>
+        <w:rPr>
+          <w:rFonts w:ascii="Arial" w:hAnsi="Arial" w:cs="Arial"/>
+        </w:rPr>
+        <w:t xml:space="preserve"> only.</w:t>
+      </w:r>
+    </w:p>
+    <w:p>
+      <w:pPr>
+        <w:rPr>
+          <w:rFonts w:ascii="Arial" w:hAnsi="Arial" w:cs="Arial"/>
+        </w:rPr>
+      </w:pPr>
+      <w:r>
+        <w:rPr>
+          <w:rFonts w:ascii="Arial" w:hAnsi="Arial" w:cs="Arial"/>
+        </w:rPr>
+        <w:t xml:space="preserve">– </w:t>
+      </w:r>
+      <w:proofErr w:type="spellStart"/>
+      <w:r>
+        <w:rPr>
+          <w:rFonts w:ascii="Arial" w:hAnsi="Arial" w:cs="Arial"/>
+        </w:rPr>
+        <w:t>waynemanor-vm</w:t>
+      </w:r>
+      <w:proofErr w:type="spellEnd"/>
+      <w:r>
+        <w:rPr>
+          <w:rFonts w:ascii="Arial" w:hAnsi="Arial" w:cs="Arial"/>
+        </w:rPr>
+        <w:t xml:space="preserve">: </w:t>
+      </w:r>
+      <w:proofErr w:type="spellStart"/>
+      <w:r>
+        <w:rPr>
+          <w:rFonts w:ascii="Arial" w:hAnsi="Arial" w:cs="Arial"/>
+        </w:rPr>
+        <w:t>ManorNetwork</w:t>
+      </w:r>
+      <w:proofErr w:type="spellEnd"/>
+      <w:r>
+        <w:rPr>
+          <w:rFonts w:ascii="Arial" w:hAnsi="Arial" w:cs="Arial"/>
+        </w:rPr>
+        <w:t xml:space="preserve"> only.</w:t>
+      </w:r>
+    </w:p>
+    <w:p>
+      <w:pPr>
+        <w:rPr>
+          <w:rFonts w:ascii="Arial" w:hAnsi="Arial" w:cs="Arial"/>
+        </w:rPr>
+      </w:pPr>
+    </w:p>
+    <w:p>
+      <w:pPr>
+        <w:rPr>
+          <w:rFonts w:ascii="Arial" w:hAnsi="Arial" w:cs="Arial"/>
+        </w:rPr>
+      </w:pPr>
+      <w:r>
+        <w:rPr>
+          <w:rFonts w:ascii="Arial" w:hAnsi="Arial" w:cs="Arial"/>
+        </w:rPr>
+        <w:t xml:space="preserve">Configure static IP addresses on all internal interfaces using </w:t>
+      </w:r>
+      <w:proofErr w:type="spellStart"/>
+      <w:r>
+        <w:rPr>
+          <w:rFonts w:ascii="Arial" w:hAnsi="Arial" w:cs="Arial"/>
+        </w:rPr>
+        <w:t>Netplan</w:t>
+      </w:r>
+      <w:proofErr w:type="spellEnd"/>
+      <w:r>
+        <w:rPr>
+          <w:rFonts w:ascii="Arial" w:hAnsi="Arial" w:cs="Arial"/>
+        </w:rPr>
+        <w:t xml:space="preserve"> </w:t>
+      </w:r>
+    </w:p>
+    <w:p>
+      <w:pPr>
+        <w:rPr>
+          <w:rFonts w:ascii="Arial" w:hAnsi="Arial" w:cs="Arial"/>
+        </w:rPr>
+      </w:pPr>
+    </w:p>
+    <w:p>
+      <w:pPr>
+        <w:rPr>
+          <w:rFonts w:ascii="Arial" w:hAnsi="Arial" w:cs="Arial"/>
+        </w:rPr>
+      </w:pPr>
+      <w:r>
+        <w:rPr>
+          <w:rFonts w:ascii="Arial" w:hAnsi="Arial" w:cs="Arial"/>
+        </w:rPr>
+        <w:t>Verify connectivity between all VMs through the gateway using ICMP (ping)</w:t>
+      </w:r>
+    </w:p>
+    <w:p>
+      <w:pPr>
+        <w:rPr>
+          <w:rFonts w:ascii="Arial" w:hAnsi="Arial" w:cs="Arial"/>
+        </w:rPr>
+      </w:pPr>
+    </w:p>
+    <w:p>
+      <w:pPr>
+        <w:rPr>
+          <w:rFonts w:ascii="Arial" w:hAnsi="Arial" w:cs="Arial"/>
+        </w:rPr>
+      </w:pPr>
+    </w:p>
+    <w:p>
+      <w:pPr>
+        <w:rPr>
+          <w:rFonts w:ascii="Arial" w:hAnsi="Arial" w:cs="Arial"/>
+        </w:rPr>
+      </w:pPr>
+      <w:r>
+        <w:rPr>
+          <w:rFonts w:ascii="Arial" w:hAnsi="Arial" w:cs="Arial"/>
+        </w:rPr>
+        <w:t xml:space="preserve">Task 2 </w:t>
+      </w:r>
+    </w:p>
+    <w:p>
+      <w:pPr>
+        <w:rPr>
+          <w:rFonts w:ascii="Arial" w:hAnsi="Arial" w:cs="Arial"/>
+        </w:rPr>
+      </w:pPr>
+      <w:r>
+        <w:rPr>
+          <w:rFonts w:ascii="Arial" w:hAnsi="Arial" w:cs="Arial"/>
+        </w:rPr>
+        <w:t>• Enable IP forwarding on gateway-</w:t>
+      </w:r>
+      <w:proofErr w:type="spellStart"/>
+      <w:r>
+        <w:rPr>
+          <w:rFonts w:ascii="Arial" w:hAnsi="Arial" w:cs="Arial"/>
+        </w:rPr>
+        <w:t>vm</w:t>
+      </w:r>
+      <w:proofErr w:type="spellEnd"/>
+      <w:r>
+        <w:rPr>
+          <w:rFonts w:ascii="Arial" w:hAnsi="Arial" w:cs="Arial"/>
+        </w:rPr>
+        <w:t xml:space="preserve">. </w:t>
+      </w:r>
+    </w:p>
+    <w:p>
+      <w:pPr>
+        <w:rPr>
+          <w:rFonts w:ascii="Arial" w:hAnsi="Arial" w:cs="Arial"/>
+        </w:rPr>
+      </w:pPr>
+    </w:p>
+    <w:p>
+      <w:pPr>
+        <w:rPr>
+          <w:rFonts w:ascii="Arial" w:hAnsi="Arial" w:cs="Arial"/>
+        </w:rPr>
+      </w:pPr>
+      <w:r>
+        <w:rPr>
+          <w:rFonts w:ascii="Arial" w:hAnsi="Arial" w:cs="Arial"/>
+        </w:rPr>
+        <w:t xml:space="preserve">• Configure persistent NAT and routing between </w:t>
+      </w:r>
+      <w:proofErr w:type="spellStart"/>
+      <w:r>
+        <w:rPr>
+          <w:rFonts w:ascii="Arial" w:hAnsi="Arial" w:cs="Arial"/>
+        </w:rPr>
+        <w:t>BatNetwork</w:t>
+      </w:r>
+      <w:proofErr w:type="spellEnd"/>
+      <w:r>
+        <w:rPr>
+          <w:rFonts w:ascii="Arial" w:hAnsi="Arial" w:cs="Arial"/>
+        </w:rPr>
+        <w:t xml:space="preserve"> and </w:t>
+      </w:r>
+      <w:proofErr w:type="spellStart"/>
+      <w:r>
+        <w:rPr>
+          <w:rFonts w:ascii="Arial" w:hAnsi="Arial" w:cs="Arial"/>
+        </w:rPr>
+        <w:t>ManorNetwork</w:t>
+      </w:r>
+      <w:proofErr w:type="spellEnd"/>
+      <w:r>
+        <w:rPr>
+          <w:rFonts w:ascii="Arial" w:hAnsi="Arial" w:cs="Arial"/>
+        </w:rPr>
+        <w:t>.</w:t>
+      </w:r>
+    </w:p>
+    <w:p>
+      <w:pPr>
+        <w:rPr>
+          <w:rFonts w:ascii="Arial" w:hAnsi="Arial" w:cs="Arial"/>
+        </w:rPr>
+      </w:pPr>
+    </w:p>
+    <w:p>
+      <w:pPr>
+        <w:rPr>
+          <w:rFonts w:ascii="Arial" w:hAnsi="Arial" w:cs="Arial"/>
+        </w:rPr>
+      </w:pPr>
+      <w:r>
+        <w:rPr>
+          <w:rFonts w:ascii="Arial" w:hAnsi="Arial" w:cs="Arial"/>
+        </w:rPr>
+        <w:t xml:space="preserve"> • Test routing between </w:t>
+      </w:r>
+      <w:proofErr w:type="spellStart"/>
+      <w:r>
+        <w:rPr>
+          <w:rFonts w:ascii="Arial" w:hAnsi="Arial" w:cs="Arial"/>
+        </w:rPr>
+        <w:t>waynemanor-vm</w:t>
+      </w:r>
+      <w:proofErr w:type="spellEnd"/>
+      <w:r>
+        <w:rPr>
+          <w:rFonts w:ascii="Arial" w:hAnsi="Arial" w:cs="Arial"/>
+        </w:rPr>
+        <w:t xml:space="preserve"> and </w:t>
+      </w:r>
+      <w:proofErr w:type="spellStart"/>
+      <w:r>
+        <w:rPr>
+          <w:rFonts w:ascii="Arial" w:hAnsi="Arial" w:cs="Arial"/>
+        </w:rPr>
+        <w:t>batcave-vm</w:t>
+      </w:r>
+      <w:proofErr w:type="spellEnd"/>
+      <w:r>
+        <w:rPr>
+          <w:rFonts w:ascii="Arial" w:hAnsi="Arial" w:cs="Arial"/>
+        </w:rPr>
+        <w:t xml:space="preserve">. </w:t>
+      </w:r>
+    </w:p>
+    <w:p>
+      <w:pPr>
+        <w:rPr>
+          <w:rFonts w:ascii="Arial" w:hAnsi="Arial" w:cs="Arial"/>
+        </w:rPr>
+      </w:pPr>
+    </w:p>
+    <w:p>
+      <w:pPr>
+        <w:rPr>
+          <w:rFonts w:ascii="Arial" w:hAnsi="Arial" w:cs="Arial"/>
+        </w:rPr>
+      </w:pPr>
+      <w:r>
+        <w:rPr>
+          <w:rFonts w:ascii="Arial" w:hAnsi="Arial" w:cs="Arial"/>
+        </w:rPr>
+        <w:t>• Use OS tools (</w:t>
+      </w:r>
+      <w:proofErr w:type="spellStart"/>
+      <w:r>
+        <w:rPr>
+          <w:rFonts w:ascii="Arial" w:hAnsi="Arial" w:cs="Arial"/>
+        </w:rPr>
+        <w:t>ip</w:t>
+      </w:r>
+      <w:proofErr w:type="spellEnd"/>
+      <w:r>
+        <w:rPr>
+          <w:rFonts w:ascii="Arial" w:hAnsi="Arial" w:cs="Arial"/>
+        </w:rPr>
+        <w:t xml:space="preserve"> route show, ss, </w:t>
+      </w:r>
+      <w:proofErr w:type="spellStart"/>
+      <w:r>
+        <w:rPr>
+          <w:rFonts w:ascii="Arial" w:hAnsi="Arial" w:cs="Arial"/>
+        </w:rPr>
+        <w:t>ps</w:t>
+      </w:r>
+      <w:proofErr w:type="spellEnd"/>
+      <w:r>
+        <w:rPr>
+          <w:rFonts w:ascii="Arial" w:hAnsi="Arial" w:cs="Arial"/>
+        </w:rPr>
+        <w:t xml:space="preserve">, </w:t>
+      </w:r>
+      <w:proofErr w:type="spellStart"/>
+      <w:r>
+        <w:rPr>
+          <w:rFonts w:ascii="Arial" w:hAnsi="Arial" w:cs="Arial"/>
+        </w:rPr>
+        <w:t>systemctl</w:t>
+      </w:r>
+      <w:proofErr w:type="spellEnd"/>
+      <w:r>
+        <w:rPr>
+          <w:rFonts w:ascii="Arial" w:hAnsi="Arial" w:cs="Arial"/>
+        </w:rPr>
+        <w:t>) to analyse routing and process interactions.</w:t>
+      </w:r>
+    </w:p>
+    <w:p>
+      <w:pPr>
+        <w:rPr>
+          <w:rFonts w:ascii="Arial" w:hAnsi="Arial" w:cs="Arial"/>
+        </w:rPr>
+      </w:pPr>
+    </w:p>
+    <w:p>
+      <w:pPr>
+        <w:rPr>
+          <w:rFonts w:ascii="Arial" w:hAnsi="Arial" w:cs="Arial"/>
+        </w:rPr>
+      </w:pPr>
+      <w:r>
+        <w:rPr>
+          <w:rFonts w:ascii="Arial" w:hAnsi="Arial" w:cs="Arial"/>
+        </w:rPr>
+        <w:t>Task 3</w:t>
+      </w:r>
+    </w:p>
+    <w:p>
+      <w:pPr>
+        <w:rPr>
+          <w:rFonts w:ascii="Arial" w:hAnsi="Arial" w:cs="Arial"/>
+        </w:rPr>
+      </w:pPr>
+      <w:r>
+        <w:rPr>
+          <w:rFonts w:ascii="Arial" w:hAnsi="Arial" w:cs="Arial"/>
+        </w:rPr>
+        <w:t xml:space="preserve">• Install and configure MySQL on </w:t>
+      </w:r>
+      <w:proofErr w:type="spellStart"/>
+      <w:r>
+        <w:rPr>
+          <w:rFonts w:ascii="Arial" w:hAnsi="Arial" w:cs="Arial"/>
+        </w:rPr>
+        <w:t>batcave-vm</w:t>
+      </w:r>
+      <w:proofErr w:type="spellEnd"/>
+      <w:r>
+        <w:rPr>
+          <w:rFonts w:ascii="Arial" w:hAnsi="Arial" w:cs="Arial"/>
+        </w:rPr>
+        <w:t xml:space="preserve">. </w:t>
+      </w:r>
+    </w:p>
+    <w:p>
+      <w:pPr>
+        <w:rPr>
+          <w:rFonts w:ascii="Arial" w:hAnsi="Arial" w:cs="Arial"/>
+        </w:rPr>
+      </w:pPr>
+    </w:p>
+    <w:p>
+      <w:pPr>
+        <w:rPr>
+          <w:rFonts w:ascii="Arial" w:hAnsi="Arial" w:cs="Arial"/>
+        </w:rPr>
+      </w:pPr>
+      <w:r>
+        <w:rPr>
+          <w:rFonts w:ascii="Arial" w:hAnsi="Arial" w:cs="Arial"/>
+        </w:rPr>
+        <w:t xml:space="preserve">• Install and configure Apache and PHP on </w:t>
+      </w:r>
+      <w:proofErr w:type="spellStart"/>
+      <w:r>
+        <w:rPr>
+          <w:rFonts w:ascii="Arial" w:hAnsi="Arial" w:cs="Arial"/>
+        </w:rPr>
+        <w:t>waynemanor-vm</w:t>
+      </w:r>
+      <w:proofErr w:type="spellEnd"/>
+      <w:r>
+        <w:rPr>
+          <w:rFonts w:ascii="Arial" w:hAnsi="Arial" w:cs="Arial"/>
+        </w:rPr>
+        <w:t>.</w:t>
+      </w:r>
+    </w:p>
+    <w:p>
+      <w:pPr>
+        <w:rPr>
+          <w:rFonts w:ascii="Arial" w:hAnsi="Arial" w:cs="Arial"/>
+        </w:rPr>
+      </w:pPr>
+    </w:p>
+    <w:p>
+      <w:pPr>
+        <w:rPr>
+          <w:rFonts w:ascii="Arial" w:hAnsi="Arial" w:cs="Arial"/>
+        </w:rPr>
+      </w:pPr>
+      <w:r>
+        <w:rPr>
+          <w:rFonts w:ascii="Arial" w:hAnsi="Arial" w:cs="Arial"/>
+        </w:rPr>
+        <w:t xml:space="preserve"> • Create a simple PHP web page on </w:t>
+      </w:r>
+      <w:proofErr w:type="spellStart"/>
+      <w:r>
+        <w:rPr>
+          <w:rFonts w:ascii="Arial" w:hAnsi="Arial" w:cs="Arial"/>
+        </w:rPr>
+        <w:t>waynemanor-vm</w:t>
+      </w:r>
+      <w:proofErr w:type="spellEnd"/>
+      <w:r>
+        <w:rPr>
+          <w:rFonts w:ascii="Arial" w:hAnsi="Arial" w:cs="Arial"/>
+        </w:rPr>
+        <w:t xml:space="preserve"> that connects to the MySQL database on </w:t>
+      </w:r>
+      <w:proofErr w:type="spellStart"/>
+      <w:r>
+        <w:rPr>
+          <w:rFonts w:ascii="Arial" w:hAnsi="Arial" w:cs="Arial"/>
+        </w:rPr>
+        <w:t>batcave-vm</w:t>
+      </w:r>
+      <w:proofErr w:type="spellEnd"/>
+      <w:r>
+        <w:rPr>
+          <w:rFonts w:ascii="Arial" w:hAnsi="Arial" w:cs="Arial"/>
+        </w:rPr>
+        <w:t>.</w:t>
+      </w:r>
+    </w:p>
+    <w:p>
+      <w:pPr>
+        <w:rPr>
+          <w:rFonts w:ascii="Arial" w:hAnsi="Arial" w:cs="Arial"/>
+        </w:rPr>
+      </w:pPr>
+    </w:p>
+    <w:p>
+      <w:pPr>
+        <w:rPr>
+          <w:rFonts w:ascii="Arial" w:hAnsi="Arial" w:cs="Arial"/>
+        </w:rPr>
+      </w:pPr>
+      <w:r>
+        <w:rPr>
+          <w:rFonts w:ascii="Arial" w:hAnsi="Arial" w:cs="Arial"/>
+        </w:rPr>
+        <w:t xml:space="preserve"> • Verify database connectivity and web service access using curl or a browser. </w:t>
+      </w:r>
+    </w:p>
+    <w:p>
+      <w:pPr>
+        <w:rPr>
+          <w:rFonts w:ascii="Arial" w:hAnsi="Arial" w:cs="Arial"/>
+        </w:rPr>
+      </w:pPr>
+    </w:p>
+    <w:p>
+      <w:pPr>
+        <w:rPr>
+          <w:rFonts w:ascii="Arial" w:hAnsi="Arial" w:cs="Arial"/>
+        </w:rPr>
+      </w:pPr>
+      <w:r>
+        <w:rPr>
+          <w:rFonts w:ascii="Arial" w:hAnsi="Arial" w:cs="Arial"/>
+        </w:rPr>
+        <w:lastRenderedPageBreak/>
+        <w:t>• Demonstrate process management (</w:t>
+      </w:r>
+      <w:proofErr w:type="spellStart"/>
+      <w:r>
+        <w:rPr>
+          <w:rFonts w:ascii="Arial" w:hAnsi="Arial" w:cs="Arial"/>
+        </w:rPr>
+        <w:t>systemctl</w:t>
+      </w:r>
+      <w:proofErr w:type="spellEnd"/>
+      <w:r>
+        <w:rPr>
+          <w:rFonts w:ascii="Arial" w:hAnsi="Arial" w:cs="Arial"/>
+        </w:rPr>
+        <w:t xml:space="preserve">, </w:t>
+      </w:r>
+      <w:proofErr w:type="spellStart"/>
+      <w:r>
+        <w:rPr>
+          <w:rFonts w:ascii="Arial" w:hAnsi="Arial" w:cs="Arial"/>
+        </w:rPr>
+        <w:t>ps</w:t>
+      </w:r>
+      <w:proofErr w:type="spellEnd"/>
+      <w:r>
+        <w:rPr>
+          <w:rFonts w:ascii="Arial" w:hAnsi="Arial" w:cs="Arial"/>
+        </w:rPr>
+        <w:t>, top) to show service monitoring and memory/process handling</w:t>
+      </w:r>
+    </w:p>
+    <w:p>
+      <w:pPr>
+        <w:rPr>
+          <w:rFonts w:ascii="Arial" w:hAnsi="Arial" w:cs="Arial"/>
+        </w:rPr>
+      </w:pPr>
+    </w:p>
+    <w:p>
+      <w:pPr>
+        <w:rPr>
+          <w:rFonts w:ascii="Arial" w:hAnsi="Arial" w:cs="Arial"/>
+        </w:rPr>
+      </w:pPr>
+      <w:r>
+        <w:rPr>
+          <w:rFonts w:ascii="Arial" w:hAnsi="Arial" w:cs="Arial"/>
+        </w:rPr>
+        <w:t>Task 4</w:t>
+      </w:r>
+    </w:p>
+    <w:p>
+      <w:pPr>
+        <w:rPr>
+          <w:rFonts w:ascii="Arial" w:hAnsi="Arial" w:cs="Arial"/>
+        </w:rPr>
+      </w:pPr>
+      <w:r>
+        <w:rPr>
+          <w:rFonts w:ascii="Arial" w:hAnsi="Arial" w:cs="Arial"/>
+        </w:rPr>
+        <w:t xml:space="preserve">• Configure </w:t>
+      </w:r>
+      <w:proofErr w:type="spellStart"/>
+      <w:r>
+        <w:rPr>
+          <w:rFonts w:ascii="Arial" w:hAnsi="Arial" w:cs="Arial"/>
+        </w:rPr>
+        <w:t>IPTables</w:t>
+      </w:r>
+      <w:proofErr w:type="spellEnd"/>
+      <w:r>
+        <w:rPr>
+          <w:rFonts w:ascii="Arial" w:hAnsi="Arial" w:cs="Arial"/>
+        </w:rPr>
+        <w:t xml:space="preserve"> on gateway-</w:t>
+      </w:r>
+      <w:proofErr w:type="spellStart"/>
+      <w:r>
+        <w:rPr>
+          <w:rFonts w:ascii="Arial" w:hAnsi="Arial" w:cs="Arial"/>
+        </w:rPr>
+        <w:t>vm</w:t>
+      </w:r>
+      <w:proofErr w:type="spellEnd"/>
+      <w:r>
+        <w:rPr>
+          <w:rFonts w:ascii="Arial" w:hAnsi="Arial" w:cs="Arial"/>
+        </w:rPr>
+        <w:t xml:space="preserve"> to provide NAT, port forwarding, and packet filtering. </w:t>
+      </w:r>
+    </w:p>
+    <w:p>
+      <w:pPr>
+        <w:rPr>
+          <w:rFonts w:ascii="Arial" w:hAnsi="Arial" w:cs="Arial"/>
+        </w:rPr>
+      </w:pPr>
+      <w:r>
+        <w:rPr>
+          <w:rFonts w:ascii="Arial" w:hAnsi="Arial" w:cs="Arial"/>
+        </w:rPr>
+        <w:t xml:space="preserve">• Use UFW on </w:t>
+      </w:r>
+      <w:proofErr w:type="spellStart"/>
+      <w:r>
+        <w:rPr>
+          <w:rFonts w:ascii="Arial" w:hAnsi="Arial" w:cs="Arial"/>
+        </w:rPr>
+        <w:t>batcave-vm</w:t>
+      </w:r>
+      <w:proofErr w:type="spellEnd"/>
+      <w:r>
+        <w:rPr>
+          <w:rFonts w:ascii="Arial" w:hAnsi="Arial" w:cs="Arial"/>
+        </w:rPr>
+        <w:t xml:space="preserve"> and </w:t>
+      </w:r>
+      <w:proofErr w:type="spellStart"/>
+      <w:r>
+        <w:rPr>
+          <w:rFonts w:ascii="Arial" w:hAnsi="Arial" w:cs="Arial"/>
+        </w:rPr>
+        <w:t>waynemanor-vm</w:t>
+      </w:r>
+      <w:proofErr w:type="spellEnd"/>
+      <w:r>
+        <w:rPr>
+          <w:rFonts w:ascii="Arial" w:hAnsi="Arial" w:cs="Arial"/>
+        </w:rPr>
+        <w:t xml:space="preserve"> to restrict inbound and outbound traffic. </w:t>
+      </w:r>
+    </w:p>
+    <w:p>
+      <w:pPr>
+        <w:rPr>
+          <w:rFonts w:ascii="Arial" w:hAnsi="Arial" w:cs="Arial"/>
+        </w:rPr>
+      </w:pPr>
+      <w:r>
+        <w:rPr>
+          <w:rFonts w:ascii="Arial" w:hAnsi="Arial" w:cs="Arial"/>
+        </w:rPr>
+        <w:t xml:space="preserve">• Ensure only necessary ports are open: – HTTP (80) on </w:t>
+      </w:r>
+      <w:proofErr w:type="spellStart"/>
+      <w:r>
+        <w:rPr>
+          <w:rFonts w:ascii="Arial" w:hAnsi="Arial" w:cs="Arial"/>
+        </w:rPr>
+        <w:t>waynemanor-vm</w:t>
+      </w:r>
+      <w:proofErr w:type="spellEnd"/>
+      <w:r>
+        <w:rPr>
+          <w:rFonts w:ascii="Arial" w:hAnsi="Arial" w:cs="Arial"/>
+        </w:rPr>
+        <w:t xml:space="preserve"> – MySQL (3306) on </w:t>
+      </w:r>
+      <w:proofErr w:type="spellStart"/>
+      <w:r>
+        <w:rPr>
+          <w:rFonts w:ascii="Arial" w:hAnsi="Arial" w:cs="Arial"/>
+        </w:rPr>
+        <w:t>batcave-vm</w:t>
+      </w:r>
+      <w:proofErr w:type="spellEnd"/>
+      <w:r>
+        <w:rPr>
+          <w:rFonts w:ascii="Arial" w:hAnsi="Arial" w:cs="Arial"/>
+        </w:rPr>
+        <w:t xml:space="preserve"> </w:t>
+      </w:r>
+    </w:p>
+    <w:p>
+      <w:pPr>
+        <w:rPr>
+          <w:rFonts w:ascii="Arial" w:hAnsi="Arial" w:cs="Arial"/>
+        </w:rPr>
+      </w:pPr>
+      <w:r>
+        <w:rPr>
+          <w:rFonts w:ascii="Arial" w:hAnsi="Arial" w:cs="Arial"/>
+        </w:rPr>
+        <w:t xml:space="preserve">• Analyse firewall rule interaction with OS process and network management. Note: UFW is a front-end interface for iptables that modifies the same underlying kernel-level </w:t>
+      </w:r>
+      <w:proofErr w:type="spellStart"/>
+      <w:r>
+        <w:rPr>
+          <w:rFonts w:ascii="Arial" w:hAnsi="Arial" w:cs="Arial"/>
+        </w:rPr>
+        <w:t>netfilter</w:t>
+      </w:r>
+      <w:proofErr w:type="spellEnd"/>
+      <w:r>
+        <w:rPr>
+          <w:rFonts w:ascii="Arial" w:hAnsi="Arial" w:cs="Arial"/>
+        </w:rPr>
+        <w:t xml:space="preserve"> rules</w:t>
+      </w:r>
+      <w:r>
+        <w:rPr>
+          <w:rFonts w:ascii="Arial" w:hAnsi="Arial" w:cs="Arial"/>
+        </w:rPr>
+        <w:t>.</w:t>
+      </w:r>
+    </w:p>
+    <w:p>
+      <w:pPr>
+        <w:rPr>
+          <w:rFonts w:ascii="Arial" w:hAnsi="Arial" w:cs="Arial"/>
+        </w:rPr>
+      </w:pPr>
+    </w:p>
+    <w:p>
+      <w:pPr>
+        <w:rPr>
+          <w:rFonts w:ascii="Arial" w:hAnsi="Arial" w:cs="Arial"/>
+        </w:rPr>
+      </w:pPr>
+      <w:r>
+        <w:rPr>
+          <w:rFonts w:ascii="Arial" w:hAnsi="Arial" w:cs="Arial"/>
+        </w:rPr>
+        <w:t xml:space="preserve">Task 5 </w:t>
+      </w:r>
+    </w:p>
+    <w:p>
+      <w:pPr>
+        <w:rPr>
+          <w:rFonts w:ascii="Arial" w:hAnsi="Arial" w:cs="Arial"/>
+        </w:rPr>
+      </w:pPr>
+      <w:r>
+        <w:rPr>
+          <w:rFonts w:ascii="Arial" w:hAnsi="Arial" w:cs="Arial"/>
+        </w:rPr>
+        <w:t xml:space="preserve">• Test web application access from </w:t>
+      </w:r>
+      <w:proofErr w:type="spellStart"/>
+      <w:r>
+        <w:rPr>
+          <w:rFonts w:ascii="Arial" w:hAnsi="Arial" w:cs="Arial"/>
+        </w:rPr>
+        <w:t>waynemanor-vm</w:t>
+      </w:r>
+      <w:proofErr w:type="spellEnd"/>
+      <w:r>
+        <w:rPr>
+          <w:rFonts w:ascii="Arial" w:hAnsi="Arial" w:cs="Arial"/>
+        </w:rPr>
+        <w:t xml:space="preserve"> to </w:t>
+      </w:r>
+      <w:proofErr w:type="spellStart"/>
+      <w:r>
+        <w:rPr>
+          <w:rFonts w:ascii="Arial" w:hAnsi="Arial" w:cs="Arial"/>
+        </w:rPr>
+        <w:t>batcave-vm</w:t>
+      </w:r>
+      <w:proofErr w:type="spellEnd"/>
+      <w:r>
+        <w:rPr>
+          <w:rFonts w:ascii="Arial" w:hAnsi="Arial" w:cs="Arial"/>
+        </w:rPr>
+        <w:t xml:space="preserve"> (database query success). </w:t>
+      </w:r>
+    </w:p>
+    <w:p>
+      <w:pPr>
+        <w:rPr>
+          <w:rFonts w:ascii="Arial" w:hAnsi="Arial" w:cs="Arial"/>
+        </w:rPr>
+      </w:pPr>
+    </w:p>
+    <w:p>
+      <w:pPr>
+        <w:rPr>
+          <w:rFonts w:ascii="Arial" w:hAnsi="Arial" w:cs="Arial"/>
+        </w:rPr>
+      </w:pPr>
+      <w:r>
+        <w:rPr>
+          <w:rFonts w:ascii="Arial" w:hAnsi="Arial" w:cs="Arial"/>
+        </w:rPr>
+        <w:t>• Verify routing and firewall behaviour by performing traceroute and connection tests.</w:t>
+      </w:r>
+    </w:p>
+    <w:p>
+      <w:pPr>
+        <w:rPr>
+          <w:rFonts w:ascii="Arial" w:hAnsi="Arial" w:cs="Arial"/>
+        </w:rPr>
+      </w:pPr>
+    </w:p>
+    <w:p>
+      <w:pPr>
+        <w:rPr>
+          <w:rFonts w:ascii="Arial" w:hAnsi="Arial" w:cs="Arial"/>
+        </w:rPr>
+      </w:pPr>
+      <w:r>
+        <w:rPr>
+          <w:rFonts w:ascii="Arial" w:hAnsi="Arial" w:cs="Arial"/>
+        </w:rPr>
+        <w:t xml:space="preserve"> • Confirm that external Internet access (via NAT) functions as expected.</w:t>
+      </w:r>
+    </w:p>
+    <w:p>
+      <w:pPr>
+        <w:rPr>
+          <w:rFonts w:ascii="Arial" w:hAnsi="Arial" w:cs="Arial"/>
+        </w:rPr>
+      </w:pPr>
+    </w:p>
+    <w:p>
+      <w:pPr>
+        <w:rPr>
+          <w:rFonts w:ascii="Arial" w:hAnsi="Arial" w:cs="Arial"/>
+        </w:rPr>
+      </w:pPr>
+      <w:r>
+        <w:rPr>
+          <w:rFonts w:ascii="Arial" w:hAnsi="Arial" w:cs="Arial"/>
+        </w:rPr>
+        <w:t xml:space="preserve"> • Document observed OS-level responses during connection attempts.</w:t>
+      </w:r>
+    </w:p>
+    <w:p>
+      <w:pPr>
+        <w:rPr>
+          <w:rFonts w:ascii="Arial" w:hAnsi="Arial" w:cs="Arial"/>
+        </w:rPr>
+      </w:pPr>
+    </w:p>
+    <w:p>
+      <w:pPr>
+        <w:rPr>
+          <w:rFonts w:ascii="Arial" w:hAnsi="Arial" w:cs="Arial"/>
+        </w:rPr>
+      </w:pPr>
+    </w:p>
+    <w:p>
+      <w:pPr>
+        <w:rPr>
+          <w:rFonts w:ascii="Arial" w:hAnsi="Arial" w:cs="Arial"/>
+        </w:rPr>
+      </w:pPr>
+      <w:r>
+        <w:rPr>
+          <w:rFonts w:ascii="Arial" w:hAnsi="Arial" w:cs="Arial"/>
+        </w:rPr>
+        <w:t>Task 6</w:t>
+      </w:r>
+    </w:p>
+    <w:p>
+      <w:pPr>
+        <w:rPr>
+          <w:rFonts w:ascii="Arial" w:hAnsi="Arial" w:cs="Arial"/>
+        </w:rPr>
+      </w:pPr>
+      <w:r>
+        <w:rPr>
+          <w:rFonts w:ascii="Arial" w:hAnsi="Arial" w:cs="Arial"/>
+        </w:rPr>
+        <w:t>• Include annotated screenshots of key configurations (</w:t>
+      </w:r>
+      <w:proofErr w:type="spellStart"/>
+      <w:r>
+        <w:rPr>
+          <w:rFonts w:ascii="Arial" w:hAnsi="Arial" w:cs="Arial"/>
+        </w:rPr>
+        <w:t>Netplan</w:t>
+      </w:r>
+      <w:proofErr w:type="spellEnd"/>
+      <w:r>
+        <w:rPr>
+          <w:rFonts w:ascii="Arial" w:hAnsi="Arial" w:cs="Arial"/>
+        </w:rPr>
+        <w:t xml:space="preserve">, iptables, UFW, routing tables). </w:t>
+      </w:r>
+    </w:p>
+    <w:p>
+      <w:pPr>
+        <w:rPr>
+          <w:rFonts w:ascii="Arial" w:hAnsi="Arial" w:cs="Arial"/>
+        </w:rPr>
+      </w:pPr>
+      <w:r>
+        <w:rPr>
+          <w:rFonts w:ascii="Arial" w:hAnsi="Arial" w:cs="Arial"/>
+        </w:rPr>
+        <w:t xml:space="preserve">• Provide reflection discussing: </w:t>
+      </w:r>
+    </w:p>
+    <w:p>
+      <w:pPr>
+        <w:ind w:firstLine="720"/>
+        <w:rPr>
+          <w:rFonts w:ascii="Arial" w:hAnsi="Arial" w:cs="Arial"/>
+        </w:rPr>
+      </w:pPr>
+      <w:r>
+        <w:rPr>
+          <w:rFonts w:ascii="Arial" w:hAnsi="Arial" w:cs="Arial"/>
+        </w:rPr>
+        <w:t xml:space="preserve">– How NAT and routing enable distributed service delivery. </w:t>
+      </w:r>
+    </w:p>
+    <w:p>
+      <w:pPr>
+        <w:ind w:firstLine="720"/>
+        <w:rPr>
+          <w:rFonts w:ascii="Arial" w:hAnsi="Arial" w:cs="Arial"/>
+        </w:rPr>
+      </w:pPr>
+      <w:r>
+        <w:rPr>
+          <w:rFonts w:ascii="Arial" w:hAnsi="Arial" w:cs="Arial"/>
+        </w:rPr>
+        <w:t xml:space="preserve">– Comparison of iptables and UFW in OS-level control. </w:t>
+      </w:r>
+    </w:p>
+    <w:p>
+      <w:pPr>
+        <w:ind w:firstLine="720"/>
+        <w:rPr>
+          <w:rFonts w:ascii="Arial" w:hAnsi="Arial" w:cs="Arial"/>
+        </w:rPr>
+      </w:pPr>
+      <w:r>
+        <w:rPr>
+          <w:rFonts w:ascii="Arial" w:hAnsi="Arial" w:cs="Arial"/>
+        </w:rPr>
+        <w:t>– OS process and memory handling for running services.</w:t>
+      </w:r>
+    </w:p>
     <w:p>
       <w:pPr>
         <w:rPr>
@@ -622,7 +1675,6 @@
   <w:style w:type="character" w:default="1" w:styleId="DefaultParagraphFont">
     <w:name w:val="Default Paragraph Font"/>
     <w:uiPriority w:val="1"/>
-    <w:semiHidden/>
     <w:unhideWhenUsed/>
   </w:style>
   <w:style w:type="table" w:default="1" w:styleId="TableNormal">

</xml_diff>